<commit_message>
Strengthen HR positioning and public CVs
</commit_message>
<xml_diff>
--- a/public/downloads/Artjom_Warkentin_Lebenslauf_Technischer_IT_Service_Elektronik_Public.docx
+++ b/public/downloads/Artjom_Warkentin_Lebenslauf_Technischer_IT_Service_Elektronik_Public.docx
@@ -78,63 +78,21 @@
           <w:sz w:val="20"/>
           <w:szCs w:val="20"/>
         </w:rPr>
-        <w:t xml:space="preserve">Mehr als zehn Jahre praktische Erfahrung in Diagnose, Reparatur und Werkstattprozessen für Computertechnik, Peripherie und elektronische Baugruppen.</w:t>
-      </w:r>
-    </w:p>
-    <w:p>
-      <w:pPr>
-        <w:spacing w:after="90"/>
-      </w:pPr>
-      <w:r>
-        <w:rPr>
-          <w:b w:val="false"/>
-          <w:bCs w:val="false"/>
-          <w:sz w:val="20"/>
-          <w:szCs w:val="20"/>
-        </w:rPr>
-        <w:t xml:space="preserve">Aktuelle Praxis in Deutschland mit technischer Systembetreuung, Schnittstellen, Datenflüssen, Tests, Dokumentation und interner Prozessqualität.</w:t>
-      </w:r>
-    </w:p>
-    <w:p>
-      <w:pPr>
-        <w:spacing w:after="90"/>
-      </w:pPr>
-      <w:r>
-        <w:rPr>
-          <w:b w:val="false"/>
-          <w:bCs w:val="false"/>
-          <w:sz w:val="20"/>
-          <w:szCs w:val="20"/>
-        </w:rPr>
-        <w:t xml:space="preserve">Sicher im Umgang mit Windows Server, Linux, TrueNAS/NAS, SMB-Ablagen, Benutzer- und Rechtekonzepten, RDP, VPN, DNS- und Backup-Grundlagen.</w:t>
-      </w:r>
-    </w:p>
-    <w:p>
-      <w:pPr>
-        <w:spacing w:after="90"/>
-      </w:pPr>
-      <w:r>
-        <w:rPr>
-          <w:b w:val="false"/>
-          <w:bCs w:val="false"/>
-          <w:sz w:val="20"/>
-          <w:szCs w:val="20"/>
-        </w:rPr>
-        <w:t xml:space="preserve">Hands-on in Elektronikdiagnose mit Schaltplanlesen, Multimeter, Oszilloskop, SMD/THT-Löten, Heißluft, Mikroskop, BGA-Rework und Firmware-/BIOS-Arbeiten.</w:t>
-      </w:r>
-    </w:p>
-    <w:p>
-      <w:pPr>
-        <w:spacing w:after="90"/>
-      </w:pPr>
-      <w:r>
-        <w:rPr>
-          <w:b w:val="false"/>
-          <w:bCs w:val="false"/>
-          <w:sz w:val="20"/>
-          <w:szCs w:val="20"/>
-        </w:rPr>
-        <w:t xml:space="preserve">Nutzt KI-gestützte Werkzeuge pragmatisch für Recherche, Dokumentation, Skripte, API-Analyse, Testvorbereitung und Codebase-Verständnis.</w:t>
+        <w:t xml:space="preserve">Mehr als zehn Jahre Werkstatt- und Servicepraxis in Diagnose, Reparatur, Qualität und Dokumentation elektronischer Baugruppen.</w:t>
+      </w:r>
+    </w:p>
+    <w:p>
+      <w:pPr>
+        <w:spacing w:after="90"/>
+      </w:pPr>
+      <w:r>
+        <w:rPr>
+          <w:b w:val="false"/>
+          <w:bCs w:val="false"/>
+          <w:sz w:val="20"/>
+          <w:szCs w:val="20"/>
+        </w:rPr>
+        <w:t xml:space="preserve">Aktuelle Erfahrung in technischer Systembetreuung, TrueNAS/NAS, Schnittstellen, UAT, Fehleranalyse und KI-gestützter Dokumentation.</w:t>
       </w:r>
     </w:p>
     <w:p>
@@ -180,77 +138,77 @@
           <w:sz w:val="20"/>
           <w:szCs w:val="20"/>
         </w:rPr>
-        <w:t xml:space="preserve">IT-Infrastruktur: Windows Server · Linux · TrueNAS/NAS · SMB-Shares · Benutzer/Rechte · RDP</w:t>
-      </w:r>
-    </w:p>
-    <w:p>
-      <w:pPr>
-        <w:spacing w:after="90"/>
-      </w:pPr>
-      <w:r>
-        <w:rPr>
-          <w:b w:val="false"/>
-          <w:bCs w:val="false"/>
-          <w:sz w:val="20"/>
-          <w:szCs w:val="20"/>
-        </w:rPr>
-        <w:t xml:space="preserve">Netzwerk &amp; Betrieb: Netzwerk-Basics · VPN · Caching DNS · Backups · Remote-Support · Dokumentation</w:t>
-      </w:r>
-    </w:p>
-    <w:p>
-      <w:pPr>
-        <w:spacing w:after="90"/>
-      </w:pPr>
-      <w:r>
-        <w:rPr>
-          <w:b w:val="false"/>
-          <w:bCs w:val="false"/>
-          <w:sz w:val="20"/>
-          <w:szCs w:val="20"/>
-        </w:rPr>
-        <w:t xml:space="preserve">Elektronikdiagnose: Schaltplanlesen · Stromversorgung · Mainboards · Netzteile · Monitore · Router</w:t>
-      </w:r>
-    </w:p>
-    <w:p>
-      <w:pPr>
-        <w:spacing w:after="90"/>
-      </w:pPr>
-      <w:r>
-        <w:rPr>
-          <w:b w:val="false"/>
-          <w:bCs w:val="false"/>
-          <w:sz w:val="20"/>
-          <w:szCs w:val="20"/>
-        </w:rPr>
-        <w:t xml:space="preserve">Mess- und Reparaturtechnik: Multimeter · Oszilloskop · SMD/THT · Heißluft · Mikroskop · BGA-Rework</w:t>
-      </w:r>
-    </w:p>
-    <w:p>
-      <w:pPr>
-        <w:spacing w:after="90"/>
-      </w:pPr>
-      <w:r>
-        <w:rPr>
-          <w:b w:val="false"/>
-          <w:bCs w:val="false"/>
-          <w:sz w:val="20"/>
-          <w:szCs w:val="20"/>
-        </w:rPr>
-        <w:t xml:space="preserve">Web/API Testing: Postman · Manual API Testing · Browser DevTools · Website Testing · HTML/CSS/JS/PHP lesen</w:t>
-      </w:r>
-    </w:p>
-    <w:p>
-      <w:pPr>
-        <w:spacing w:after="90"/>
-      </w:pPr>
-      <w:r>
-        <w:rPr>
-          <w:b w:val="false"/>
-          <w:bCs w:val="false"/>
-          <w:sz w:val="20"/>
-          <w:szCs w:val="20"/>
-        </w:rPr>
-        <w:t xml:space="preserve">AI-assisted Workflows: Technische Dokumentation · Scripting · Codebase Analysis · Parser · README · Projektgraphen</w:t>
+        <w:t xml:space="preserve">IT-Infrastruktur &amp; Betrieb: Windows Server · Linux · TrueNAS/NAS · SMB-Shares · Benutzer/Rechte · Active Directory-Grundlagen · RDP · USB-over-RDP/Port-Weiterleitung</w:t>
+      </w:r>
+    </w:p>
+    <w:p>
+      <w:pPr>
+        <w:spacing w:after="90"/>
+      </w:pPr>
+      <w:r>
+        <w:rPr>
+          <w:b w:val="false"/>
+          <w:bCs w:val="false"/>
+          <w:sz w:val="20"/>
+          <w:szCs w:val="20"/>
+        </w:rPr>
+        <w:t xml:space="preserve">Netzwerk, Zugriff &amp; Datensicherheit: Netzwerk-Basics · VPN · Caching DNS · Backups · Ablagekonzepte · Berechtigungen · DSGVO-Bewusstsein · technische Dokumentation</w:t>
+      </w:r>
+    </w:p>
+    <w:p>
+      <w:pPr>
+        <w:spacing w:after="90"/>
+      </w:pPr>
+      <w:r>
+        <w:rPr>
+          <w:b w:val="false"/>
+          <w:bCs w:val="false"/>
+          <w:sz w:val="20"/>
+          <w:szCs w:val="20"/>
+        </w:rPr>
+        <w:t xml:space="preserve">Elektronikdiagnose: Schaltplanlesen · technische Dokumentation lesen · Stromversorgungsdiagnose · Kurzschlussanalyse · Mainboards · Netzteile · Monitore · Router</w:t>
+      </w:r>
+    </w:p>
+    <w:p>
+      <w:pPr>
+        <w:spacing w:after="90"/>
+      </w:pPr>
+      <w:r>
+        <w:rPr>
+          <w:b w:val="false"/>
+          <w:bCs w:val="false"/>
+          <w:sz w:val="20"/>
+          <w:szCs w:val="20"/>
+        </w:rPr>
+        <w:t xml:space="preserve">Mess- und Reparaturtechnik: Multimeter · Oszilloskop · SMD/THT-Löten · Heißluft · Mikroskop · BGA-Rework · Reflow/Reballing · ESD-sicheres Arbeiten</w:t>
+      </w:r>
+    </w:p>
+    <w:p>
+      <w:pPr>
+        <w:spacing w:after="90"/>
+      </w:pPr>
+      <w:r>
+        <w:rPr>
+          <w:b w:val="false"/>
+          <w:bCs w:val="false"/>
+          <w:sz w:val="20"/>
+          <w:szCs w:val="20"/>
+        </w:rPr>
+        <w:t xml:space="preserve">Web/API-Tests &amp; Tools: Postman · manuelle API-Prüfung · Browser DevTools · Website-Tests · Fehlernachverfolgung · HTML/CSS/JS/PHP lesen · Python-Skripte</w:t>
+      </w:r>
+    </w:p>
+    <w:p>
+      <w:pPr>
+        <w:spacing w:after="90"/>
+      </w:pPr>
+      <w:r>
+        <w:rPr>
+          <w:b w:val="false"/>
+          <w:bCs w:val="false"/>
+          <w:sz w:val="20"/>
+          <w:szCs w:val="20"/>
+        </w:rPr>
+        <w:t xml:space="preserve">KI-gestützte technische Arbeit: technische Recherche · Dokumentation · Skripte · Codebase-Analyse · Parser · Testvorbereitung · Projektgraphen · README/technische Unterlagen</w:t>
       </w:r>
     </w:p>
     <w:p>
@@ -301,92 +259,75 @@
           <w:sz w:val="20"/>
           <w:szCs w:val="20"/>
         </w:rPr>
-        <w:t xml:space="preserve">Technische Anforderungen, Systemintegration, UAT, Dokumentation, interne IT-nahe Infrastruktur.</w:t>
-      </w:r>
-    </w:p>
-    <w:p>
-      <w:pPr>
-        <w:pStyle w:val="ListParagraph"/>
-        <w:numPr>
-          <w:ilvl w:val="0"/>
-          <w:numId w:val="1"/>
-        </w:numPr>
-        <w:spacing w:after="60"/>
-      </w:pPr>
-      <w:r>
-        <w:rPr>
-          <w:sz w:val="20"/>
-          <w:szCs w:val="20"/>
-        </w:rPr>
-        <w:t xml:space="preserve">Aufbau und Betrieb eines TrueNAS-basierten Projektspeichers mit Ablage-, Zugriffs- und Nutzungskonzept für Fachbereiche.</w:t>
-      </w:r>
-    </w:p>
-    <w:p>
-      <w:pPr>
-        <w:pStyle w:val="ListParagraph"/>
-        <w:numPr>
-          <w:ilvl w:val="0"/>
-          <w:numId w:val="1"/>
-        </w:numPr>
-        <w:spacing w:after="60"/>
-      </w:pPr>
-      <w:r>
-        <w:rPr>
-          <w:sz w:val="20"/>
-          <w:szCs w:val="20"/>
-        </w:rPr>
-        <w:t xml:space="preserve">Analyse technischer Anforderungen, Schnittstellen, Datenflüsse und Systemprozesse; Erstellung von Pflichtenheften, Prozessskizzen und Abnahmekriterien.</w:t>
-      </w:r>
-    </w:p>
-    <w:p>
-      <w:pPr>
-        <w:pStyle w:val="ListParagraph"/>
-        <w:numPr>
-          <w:ilvl w:val="0"/>
-          <w:numId w:val="1"/>
-        </w:numPr>
-        <w:spacing w:after="60"/>
-      </w:pPr>
-      <w:r>
-        <w:rPr>
-          <w:sz w:val="20"/>
-          <w:szCs w:val="20"/>
-        </w:rPr>
-        <w:t xml:space="preserve">Testvorbereitung, UAT, Fehlernachverfolgung, Abnahmen und nachvollziehbare Dokumentation von Änderungen und Ergebnissen.</w:t>
-      </w:r>
-    </w:p>
-    <w:p>
-      <w:pPr>
-        <w:pStyle w:val="ListParagraph"/>
-        <w:numPr>
-          <w:ilvl w:val="0"/>
-          <w:numId w:val="1"/>
-        </w:numPr>
-        <w:spacing w:after="60"/>
-      </w:pPr>
-      <w:r>
-        <w:rPr>
-          <w:sz w:val="20"/>
-          <w:szCs w:val="20"/>
-        </w:rPr>
-        <w:t xml:space="preserve">KI-gestützte Strukturierung von Spezifikationen, technische Recherche, Konsistenzprüfung und Unterstützung bei Skripten, Checklisten und Dokumentation.</w:t>
-      </w:r>
-    </w:p>
-    <w:p>
-      <w:pPr>
-        <w:pStyle w:val="ListParagraph"/>
-        <w:numPr>
-          <w:ilvl w:val="0"/>
-          <w:numId w:val="1"/>
-        </w:numPr>
-        <w:spacing w:after="60"/>
-      </w:pPr>
-      <w:r>
-        <w:rPr>
-          <w:sz w:val="20"/>
-          <w:szCs w:val="20"/>
-        </w:rPr>
-        <w:t xml:space="preserve">Kommunikation zwischen Fachbereichen, Anwendern und technischer Umsetzung mit Fokus auf Klärung, Servicefähigkeit und Qualität.</w:t>
+        <w:t xml:space="preserve">Technische Anforderungen, interne IT-nahe Infrastruktur, Systemintegration, Tests, Dokumentation und Qualität.</w:t>
+      </w:r>
+    </w:p>
+    <w:p>
+      <w:pPr>
+        <w:pStyle w:val="ListParagraph"/>
+        <w:numPr>
+          <w:ilvl w:val="0"/>
+          <w:numId w:val="1"/>
+        </w:numPr>
+        <w:spacing w:after="60"/>
+      </w:pPr>
+      <w:r>
+        <w:rPr>
+          <w:sz w:val="20"/>
+          <w:szCs w:val="20"/>
+        </w:rPr>
+        <w:t xml:space="preserve">TrueNAS-basierten Projektspeicher aufgebaut und betrieben: Ablagekonzept, Zugriffsstruktur, Nutzung durch Fachbereiche, Performance-Tuning und technische Dokumentation.</w:t>
+      </w:r>
+    </w:p>
+    <w:p>
+      <w:pPr>
+        <w:pStyle w:val="ListParagraph"/>
+        <w:numPr>
+          <w:ilvl w:val="0"/>
+          <w:numId w:val="1"/>
+        </w:numPr>
+        <w:spacing w:after="60"/>
+      </w:pPr>
+      <w:r>
+        <w:rPr>
+          <w:sz w:val="20"/>
+          <w:szCs w:val="20"/>
+        </w:rPr>
+        <w:t xml:space="preserve">Schnittstellen, Datenflüsse und Systemprozesse analysiert und in Pflichtenheften, Prozessskizzen, Funktionsmatrizen und Abnahmekriterien nachvollziehbar dokumentiert.</w:t>
+      </w:r>
+    </w:p>
+    <w:p>
+      <w:pPr>
+        <w:pStyle w:val="ListParagraph"/>
+        <w:numPr>
+          <w:ilvl w:val="0"/>
+          <w:numId w:val="1"/>
+        </w:numPr>
+        <w:spacing w:after="60"/>
+      </w:pPr>
+      <w:r>
+        <w:rPr>
+          <w:sz w:val="20"/>
+          <w:szCs w:val="20"/>
+        </w:rPr>
+        <w:t xml:space="preserve">UAT, Nutzertests, Fehlernachverfolgung und Abnahmen vorbereitet, begleitet und Ergebnisse strukturiert dokumentiert.</w:t>
+      </w:r>
+    </w:p>
+    <w:p>
+      <w:pPr>
+        <w:pStyle w:val="ListParagraph"/>
+        <w:numPr>
+          <w:ilvl w:val="0"/>
+          <w:numId w:val="1"/>
+        </w:numPr>
+        <w:spacing w:after="60"/>
+      </w:pPr>
+      <w:r>
+        <w:rPr>
+          <w:sz w:val="20"/>
+          <w:szCs w:val="20"/>
+        </w:rPr>
+        <w:t xml:space="preserve">KI-gestützte Spezifikations- und Dokumentationsarbeit eingesetzt, um Konsistenz, technische Recherche, Checklisten, Skripte und Testvorbereitung schneller und sauberer umzusetzen.</w:t>
       </w:r>
     </w:p>
     <w:p>
@@ -428,41 +369,58 @@
           <w:sz w:val="20"/>
           <w:szCs w:val="20"/>
         </w:rPr>
-        <w:t xml:space="preserve">Stabilisierung von Aufgabensteuerung, Fehlerklärung, Tests und Release-Abstimmung in einer Übergangsphase.</w:t>
-      </w:r>
-    </w:p>
-    <w:p>
-      <w:pPr>
-        <w:pStyle w:val="ListParagraph"/>
-        <w:numPr>
-          <w:ilvl w:val="0"/>
-          <w:numId w:val="1"/>
-        </w:numPr>
-        <w:spacing w:after="60"/>
-      </w:pPr>
-      <w:r>
-        <w:rPr>
-          <w:sz w:val="20"/>
-          <w:szCs w:val="20"/>
-        </w:rPr>
-        <w:t xml:space="preserve">Strukturierte Abstimmungen, Testbegleitung, Nutzerabnahmen und technische Klaerung offener Punkte.</w:t>
-      </w:r>
-    </w:p>
-    <w:p>
-      <w:pPr>
-        <w:pStyle w:val="ListParagraph"/>
-        <w:numPr>
-          <w:ilvl w:val="0"/>
-          <w:numId w:val="1"/>
-        </w:numPr>
-        <w:spacing w:after="60"/>
-      </w:pPr>
-      <w:r>
-        <w:rPr>
-          <w:sz w:val="20"/>
-          <w:szCs w:val="20"/>
-        </w:rPr>
-        <w:t xml:space="preserve">Verbesserung der Nachvollziehbarkeit von Aufgaben, Rückfragen und Ergebnisdokumentation.</w:t>
+        <w:t xml:space="preserve">Stabilisierung technischer Abläufe, Aufgabenklärung, Tests und Release-Abstimmung in einer Übergangsphase.</w:t>
+      </w:r>
+    </w:p>
+    <w:p>
+      <w:pPr>
+        <w:pStyle w:val="ListParagraph"/>
+        <w:numPr>
+          <w:ilvl w:val="0"/>
+          <w:numId w:val="1"/>
+        </w:numPr>
+        <w:spacing w:after="60"/>
+      </w:pPr>
+      <w:r>
+        <w:rPr>
+          <w:sz w:val="20"/>
+          <w:szCs w:val="20"/>
+        </w:rPr>
+        <w:t xml:space="preserve">Technische Abstimmungen strukturiert, offene Punkte geklärt und Aufgaben für Umsetzung, Tests und Abnahmen nachvollziehbar gemacht.</w:t>
+      </w:r>
+    </w:p>
+    <w:p>
+      <w:pPr>
+        <w:pStyle w:val="ListParagraph"/>
+        <w:numPr>
+          <w:ilvl w:val="0"/>
+          <w:numId w:val="1"/>
+        </w:numPr>
+        <w:spacing w:after="60"/>
+      </w:pPr>
+      <w:r>
+        <w:rPr>
+          <w:sz w:val="20"/>
+          <w:szCs w:val="20"/>
+        </w:rPr>
+        <w:t xml:space="preserve">Nutzertests begleitet, Fehlerrückmeldungen eingeordnet und technische Ergebnisse für Fachbereiche verständlich dokumentiert.</w:t>
+      </w:r>
+    </w:p>
+    <w:p>
+      <w:pPr>
+        <w:pStyle w:val="ListParagraph"/>
+        <w:numPr>
+          <w:ilvl w:val="0"/>
+          <w:numId w:val="1"/>
+        </w:numPr>
+        <w:spacing w:after="60"/>
+      </w:pPr>
+      <w:r>
+        <w:rPr>
+          <w:sz w:val="20"/>
+          <w:szCs w:val="20"/>
+        </w:rPr>
+        <w:t xml:space="preserve">Service- und Qualitätsdenken aus dem Werkstattumfeld in interne IT-Abläufe übertragen: klare Zustände, reproduzierbare Fehlerbilder, saubere Übergaben.</w:t>
       </w:r>
     </w:p>
     <w:p>
@@ -504,41 +462,58 @@
           <w:sz w:val="20"/>
           <w:szCs w:val="20"/>
         </w:rPr>
-        <w:t xml:space="preserve">Anforderungsanalyse, technische Konzepte und strukturierte Übergaben.</w:t>
-      </w:r>
-    </w:p>
-    <w:p>
-      <w:pPr>
-        <w:pStyle w:val="ListParagraph"/>
-        <w:numPr>
-          <w:ilvl w:val="0"/>
-          <w:numId w:val="1"/>
-        </w:numPr>
-        <w:spacing w:after="60"/>
-      </w:pPr>
-      <w:r>
-        <w:rPr>
-          <w:sz w:val="20"/>
-          <w:szCs w:val="20"/>
-        </w:rPr>
-        <w:t xml:space="preserve">Analyse und Dokumentation interner Systemanforderungen, Stakeholder-Abstimmung und Übergabe an die technische Umsetzung.</w:t>
-      </w:r>
-    </w:p>
-    <w:p>
-      <w:pPr>
-        <w:pStyle w:val="ListParagraph"/>
-        <w:numPr>
-          <w:ilvl w:val="0"/>
-          <w:numId w:val="1"/>
-        </w:numPr>
-        <w:spacing w:after="60"/>
-      </w:pPr>
-      <w:r>
-        <w:rPr>
-          <w:sz w:val="20"/>
-          <w:szCs w:val="20"/>
-        </w:rPr>
-        <w:t xml:space="preserve">Erstellung von Konzepten und Pflichtenheften für interne Anwendungen und Prozessverbesserungen.</w:t>
+        <w:t xml:space="preserve">Anforderungsanalyse, technische Konzepte, Systemverständnis und strukturierte Übergaben.</w:t>
+      </w:r>
+    </w:p>
+    <w:p>
+      <w:pPr>
+        <w:pStyle w:val="ListParagraph"/>
+        <w:numPr>
+          <w:ilvl w:val="0"/>
+          <w:numId w:val="1"/>
+        </w:numPr>
+        <w:spacing w:after="60"/>
+      </w:pPr>
+      <w:r>
+        <w:rPr>
+          <w:sz w:val="20"/>
+          <w:szCs w:val="20"/>
+        </w:rPr>
+        <w:t xml:space="preserve">Interne Systemanforderungen aufgenommen, technisch analysiert und in klare Konzepte, Pflichtenhefte und Übergaben übersetzt.</w:t>
+      </w:r>
+    </w:p>
+    <w:p>
+      <w:pPr>
+        <w:pStyle w:val="ListParagraph"/>
+        <w:numPr>
+          <w:ilvl w:val="0"/>
+          <w:numId w:val="1"/>
+        </w:numPr>
+        <w:spacing w:after="60"/>
+      </w:pPr>
+      <w:r>
+        <w:rPr>
+          <w:sz w:val="20"/>
+          <w:szCs w:val="20"/>
+        </w:rPr>
+        <w:t xml:space="preserve">Fachliche Rückfragen mit technischer Umsetzbarkeit abgeglichen und dokumentierte Entscheidungsgrundlagen vorbereitet.</w:t>
+      </w:r>
+    </w:p>
+    <w:p>
+      <w:pPr>
+        <w:pStyle w:val="ListParagraph"/>
+        <w:numPr>
+          <w:ilvl w:val="0"/>
+          <w:numId w:val="1"/>
+        </w:numPr>
+        <w:spacing w:after="60"/>
+      </w:pPr>
+      <w:r>
+        <w:rPr>
+          <w:sz w:val="20"/>
+          <w:szCs w:val="20"/>
+        </w:rPr>
+        <w:t xml:space="preserve">Prozess- und Systemzusammenhänge visualisiert, damit Umsetzung, Test und Abnahme sauber anschließen konnten.</w:t>
       </w:r>
     </w:p>
     <w:p>
@@ -580,41 +555,75 @@
           <w:sz w:val="20"/>
           <w:szCs w:val="20"/>
         </w:rPr>
-        <w:t xml:space="preserve">Automatisierung, Serverbetrieb, Webshop, CRM-Integration und technische Umsetzung.</w:t>
-      </w:r>
-    </w:p>
-    <w:p>
-      <w:pPr>
-        <w:pStyle w:val="ListParagraph"/>
-        <w:numPr>
-          <w:ilvl w:val="0"/>
-          <w:numId w:val="1"/>
-        </w:numPr>
-        <w:spacing w:after="60"/>
-      </w:pPr>
-      <w:r>
-        <w:rPr>
-          <w:sz w:val="20"/>
-          <w:szCs w:val="20"/>
-        </w:rPr>
-        <w:t xml:space="preserve">Administration von Windows Server 2012 R2 sowie Linux/CentOS mit NGINX/Apache, MySQL und Mailserver.</w:t>
-      </w:r>
-    </w:p>
-    <w:p>
-      <w:pPr>
-        <w:pStyle w:val="ListParagraph"/>
-        <w:numPr>
-          <w:ilvl w:val="0"/>
-          <w:numId w:val="1"/>
-        </w:numPr>
-        <w:spacing w:after="60"/>
-      </w:pPr>
-      <w:r>
-        <w:rPr>
-          <w:sz w:val="20"/>
-          <w:szCs w:val="20"/>
-        </w:rPr>
-        <w:t xml:space="preserve">Webshop-Einführung, CRM-Anbindung und technische Integration mit 1C, PHP, JavaScript, HTML und CSS.</w:t>
+        <w:t xml:space="preserve">Serverbetrieb, Systemintegration, Webshop, CRM-Anbindung und technische Umsetzung im Handelsumfeld.</w:t>
+      </w:r>
+    </w:p>
+    <w:p>
+      <w:pPr>
+        <w:pStyle w:val="ListParagraph"/>
+        <w:numPr>
+          <w:ilvl w:val="0"/>
+          <w:numId w:val="1"/>
+        </w:numPr>
+        <w:spacing w:after="60"/>
+      </w:pPr>
+      <w:r>
+        <w:rPr>
+          <w:sz w:val="20"/>
+          <w:szCs w:val="20"/>
+        </w:rPr>
+        <w:t xml:space="preserve">Windows Server 2012 R2 sowie Linux/CentOS mit NGINX, Apache, MySQL und Mailserver administriert.</w:t>
+      </w:r>
+    </w:p>
+    <w:p>
+      <w:pPr>
+        <w:pStyle w:val="ListParagraph"/>
+        <w:numPr>
+          <w:ilvl w:val="0"/>
+          <w:numId w:val="1"/>
+        </w:numPr>
+        <w:spacing w:after="60"/>
+      </w:pPr>
+      <w:r>
+        <w:rPr>
+          <w:sz w:val="20"/>
+          <w:szCs w:val="20"/>
+        </w:rPr>
+        <w:t xml:space="preserve">Webshop, CRM-Anbindung und 1C-Integration technisch begleitet und Schnittstellen zwischen Warenwirtschaft, Web und internen Abläufen stabilisiert.</w:t>
+      </w:r>
+    </w:p>
+    <w:p>
+      <w:pPr>
+        <w:pStyle w:val="ListParagraph"/>
+        <w:numPr>
+          <w:ilvl w:val="0"/>
+          <w:numId w:val="1"/>
+        </w:numPr>
+        <w:spacing w:after="60"/>
+      </w:pPr>
+      <w:r>
+        <w:rPr>
+          <w:sz w:val="20"/>
+          <w:szCs w:val="20"/>
+        </w:rPr>
+        <w:t xml:space="preserve">PHP, JavaScript, HTML und CSS im Integrations- und Anpassungskontext gelesen und genutzt, ohne diese Tätigkeit als Zielrichtung zu positionieren.</w:t>
+      </w:r>
+    </w:p>
+    <w:p>
+      <w:pPr>
+        <w:pStyle w:val="ListParagraph"/>
+        <w:numPr>
+          <w:ilvl w:val="0"/>
+          <w:numId w:val="1"/>
+        </w:numPr>
+        <w:spacing w:after="60"/>
+      </w:pPr>
+      <w:r>
+        <w:rPr>
+          <w:sz w:val="20"/>
+          <w:szCs w:val="20"/>
+        </w:rPr>
+        <w:t xml:space="preserve">Server-, Web- und Prozesssicht verbunden, um technische Handelsabläufe nachvollziehbar und wartbarer zu machen.</w:t>
       </w:r>
     </w:p>
     <w:p>
@@ -656,75 +665,75 @@
           <w:sz w:val="20"/>
           <w:szCs w:val="20"/>
         </w:rPr>
-        <w:t xml:space="preserve">Elektronik-/IT-Service, Werkstattprozesse, Diagnose, Qualität und Wissenstransfer.</w:t>
-      </w:r>
-    </w:p>
-    <w:p>
-      <w:pPr>
-        <w:pStyle w:val="ListParagraph"/>
-        <w:numPr>
-          <w:ilvl w:val="0"/>
-          <w:numId w:val="1"/>
-        </w:numPr>
-        <w:spacing w:after="60"/>
-      </w:pPr>
-      <w:r>
-        <w:rPr>
-          <w:sz w:val="20"/>
-          <w:szCs w:val="20"/>
-        </w:rPr>
-        <w:t xml:space="preserve">Fachliche Verantwortung für Diagnose und Instandsetzung von Computertechnik, Notebooks, Monitoren, Tablets, Smartphones und Peripherie.</w:t>
-      </w:r>
-    </w:p>
-    <w:p>
-      <w:pPr>
-        <w:pStyle w:val="ListParagraph"/>
-        <w:numPr>
-          <w:ilvl w:val="0"/>
-          <w:numId w:val="1"/>
-        </w:numPr>
-        <w:spacing w:after="60"/>
-      </w:pPr>
-      <w:r>
-        <w:rPr>
-          <w:sz w:val="20"/>
-          <w:szCs w:val="20"/>
-        </w:rPr>
-        <w:t xml:space="preserve">Bearbeitung komplexer Fehlerbilder, Reparaturprozesse, Qualitätssicherung, SOPs, Arbeitsanweisungen, Ersatzteilmanagement und Reklamationsklärung.</w:t>
-      </w:r>
-    </w:p>
-    <w:p>
-      <w:pPr>
-        <w:pStyle w:val="ListParagraph"/>
-        <w:numPr>
-          <w:ilvl w:val="0"/>
-          <w:numId w:val="1"/>
-        </w:numPr>
-        <w:spacing w:after="60"/>
-      </w:pPr>
-      <w:r>
-        <w:rPr>
-          <w:sz w:val="20"/>
-          <w:szCs w:val="20"/>
-        </w:rPr>
-        <w:t xml:space="preserve">OEM-autorisiertes Serviceumfeld mit Herstellerfreigaben für Asus, Lenovo, Dell, Fujitsu und Acer; laufende Trainings im Hersteller-Serviceumfeld.</w:t>
-      </w:r>
-    </w:p>
-    <w:p>
-      <w:pPr>
-        <w:pStyle w:val="ListParagraph"/>
-        <w:numPr>
-          <w:ilvl w:val="0"/>
-          <w:numId w:val="1"/>
-        </w:numPr>
-        <w:spacing w:after="60"/>
-      </w:pPr>
-      <w:r>
-        <w:rPr>
-          <w:sz w:val="20"/>
-          <w:szCs w:val="20"/>
-        </w:rPr>
-        <w:t xml:space="preserve">Einarbeitung und Schulung von Mitarbeitenden sowie Aufbau strukturierter Abläufe für Werkstatt, Dokumentation und Servicequalität.</w:t>
+        <w:t xml:space="preserve">Elektronik-/IT-Service, Werkstattprozesse, Diagnose, Qualitätsstandards, Ersatzteile und Wissenstransfer.</w:t>
+      </w:r>
+    </w:p>
+    <w:p>
+      <w:pPr>
+        <w:pStyle w:val="ListParagraph"/>
+        <w:numPr>
+          <w:ilvl w:val="0"/>
+          <w:numId w:val="1"/>
+        </w:numPr>
+        <w:spacing w:after="60"/>
+      </w:pPr>
+      <w:r>
+        <w:rPr>
+          <w:sz w:val="20"/>
+          <w:szCs w:val="20"/>
+        </w:rPr>
+        <w:t xml:space="preserve">Service- und Werkstattpraxis für Notebooks, Mainboards, Monitore, Tablets, Smartphones, Peripherie und elektronische Baugruppen fachlich verantwortet.</w:t>
+      </w:r>
+    </w:p>
+    <w:p>
+      <w:pPr>
+        <w:pStyle w:val="ListParagraph"/>
+        <w:numPr>
+          <w:ilvl w:val="0"/>
+          <w:numId w:val="1"/>
+        </w:numPr>
+        <w:spacing w:after="60"/>
+      </w:pPr>
+      <w:r>
+        <w:rPr>
+          <w:sz w:val="20"/>
+          <w:szCs w:val="20"/>
+        </w:rPr>
+        <w:t xml:space="preserve">Komplexe Fehlerbilder analysiert, Reparaturwege bewertet, Qualitätsstandards, SOPs, Arbeitsanweisungen und Reklamationsklärung strukturiert.</w:t>
+      </w:r>
+    </w:p>
+    <w:p>
+      <w:pPr>
+        <w:pStyle w:val="ListParagraph"/>
+        <w:numPr>
+          <w:ilvl w:val="0"/>
+          <w:numId w:val="1"/>
+        </w:numPr>
+        <w:spacing w:after="60"/>
+      </w:pPr>
+      <w:r>
+        <w:rPr>
+          <w:sz w:val="20"/>
+          <w:szCs w:val="20"/>
+        </w:rPr>
+        <w:t xml:space="preserve">OEM-Serviceumfeld mit Herstellerfreigaben für Asus, Lenovo, Dell, Fujitsu und Acer betreut; jährliche Trainings und Herstellervorgaben in die Werkstattpraxis übertragen.</w:t>
+      </w:r>
+    </w:p>
+    <w:p>
+      <w:pPr>
+        <w:pStyle w:val="ListParagraph"/>
+        <w:numPr>
+          <w:ilvl w:val="0"/>
+          <w:numId w:val="1"/>
+        </w:numPr>
+        <w:spacing w:after="60"/>
+      </w:pPr>
+      <w:r>
+        <w:rPr>
+          <w:sz w:val="20"/>
+          <w:szCs w:val="20"/>
+        </w:rPr>
+        <w:t xml:space="preserve">Ersatzteilmanagement, Lager- und Reparaturbuchführung, Schulung neuer Mitarbeitender und Wissenstransfer im Serviceteam aufgebaut und optimiert.</w:t>
       </w:r>
     </w:p>
     <w:p>
@@ -783,24 +792,41 @@
           <w:sz w:val="20"/>
           <w:szCs w:val="20"/>
         </w:rPr>
-        <w:t xml:space="preserve">Systematische Fehlersuche, Reparaturmethoden, Funktionstests, Wissenstransfer und Einarbeitung neuer Mitarbeitender.</w:t>
-      </w:r>
-    </w:p>
-    <w:p>
-      <w:pPr>
-        <w:pStyle w:val="ListParagraph"/>
-        <w:numPr>
-          <w:ilvl w:val="0"/>
-          <w:numId w:val="1"/>
-        </w:numPr>
-        <w:spacing w:after="60"/>
-      </w:pPr>
-      <w:r>
-        <w:rPr>
-          <w:sz w:val="20"/>
-          <w:szCs w:val="20"/>
-        </w:rPr>
-        <w:t xml:space="preserve">Arbeit im autorisierten Serviceumfeld mit dokumentierten Diagnose- und Qualitätsstandards.</w:t>
+        <w:t xml:space="preserve">Schwierige Fehlerbilder an Computertechnik, Peripherie und Baugruppen systematisch eingegrenzt, instandgesetzt, geprüft und dokumentiert.</w:t>
+      </w:r>
+    </w:p>
+    <w:p>
+      <w:pPr>
+        <w:pStyle w:val="ListParagraph"/>
+        <w:numPr>
+          <w:ilvl w:val="0"/>
+          <w:numId w:val="1"/>
+        </w:numPr>
+        <w:spacing w:after="60"/>
+      </w:pPr>
+      <w:r>
+        <w:rPr>
+          <w:sz w:val="20"/>
+          <w:szCs w:val="20"/>
+        </w:rPr>
+        <w:t xml:space="preserve">Reparaturmethoden, Prüfabläufe und praktische Diagnosewege im Werkstattbetrieb weiterentwickelt.</w:t>
+      </w:r>
+    </w:p>
+    <w:p>
+      <w:pPr>
+        <w:pStyle w:val="ListParagraph"/>
+        <w:numPr>
+          <w:ilvl w:val="0"/>
+          <w:numId w:val="1"/>
+        </w:numPr>
+        <w:spacing w:after="60"/>
+      </w:pPr>
+      <w:r>
+        <w:rPr>
+          <w:sz w:val="20"/>
+          <w:szCs w:val="20"/>
+        </w:rPr>
+        <w:t xml:space="preserve">Neue Mitarbeitende eingearbeitet und technisches Wissen zu Diagnose, Löt-/Rework-Verfahren, Qualität und Dokumentation weitergegeben.</w:t>
       </w:r>
     </w:p>
     <w:p>
@@ -859,7 +885,41 @@
           <w:sz w:val="20"/>
           <w:szCs w:val="20"/>
         </w:rPr>
-        <w:t xml:space="preserve">Fehlersuche, Baugruppen- und Komponententausch, Tests, Dokumentation und kundenorientierte Serviceabwicklung.</w:t>
+        <w:t xml:space="preserve">Computertechnik diagnostiziert, Baugruppen und Komponenten instandgesetzt oder ausgetauscht und Funktionstests durchgeführt.</w:t>
+      </w:r>
+    </w:p>
+    <w:p>
+      <w:pPr>
+        <w:pStyle w:val="ListParagraph"/>
+        <w:numPr>
+          <w:ilvl w:val="0"/>
+          <w:numId w:val="1"/>
+        </w:numPr>
+        <w:spacing w:after="60"/>
+      </w:pPr>
+      <w:r>
+        <w:rPr>
+          <w:sz w:val="20"/>
+          <w:szCs w:val="20"/>
+        </w:rPr>
+        <w:t xml:space="preserve">Reparaturergebnisse dokumentiert, Ersatzteile abgestimmt und Kundenrückfragen technisch sauber beantwortet.</w:t>
+      </w:r>
+    </w:p>
+    <w:p>
+      <w:pPr>
+        <w:pStyle w:val="ListParagraph"/>
+        <w:numPr>
+          <w:ilvl w:val="0"/>
+          <w:numId w:val="1"/>
+        </w:numPr>
+        <w:spacing w:after="60"/>
+      </w:pPr>
+      <w:r>
+        <w:rPr>
+          <w:sz w:val="20"/>
+          <w:szCs w:val="20"/>
+        </w:rPr>
+        <w:t xml:space="preserve">Grundlage für die spätere Spezialisierung auf strukturierte Elektronikdiagnose und Werkstattqualität aufgebaut.</w:t>
       </w:r>
     </w:p>
     <w:p>
@@ -896,7 +956,7 @@
           <w:sz w:val="20"/>
           <w:szCs w:val="20"/>
         </w:rPr>
-        <w:t xml:space="preserve">Planung, Aufbau und Betrieb eines TrueNAS-basierten zentralen Projektspeichers mit Ablagekonzept, Benutzer-/Rechteverwaltung, Performance-Tuning und Dokumentation.</w:t>
+        <w:t xml:space="preserve">Aufbau eines zentralen Projektspeichers mit Ablagekonzept, Rechte- und Zugriffstruktur, Betrieb, Performance-Tuning und technischer Dokumentation. Nutzen: weniger lokale Dateiinseln, klarere Zuständigkeiten und nachvollziehbare Projektablage.</w:t>
       </w:r>
     </w:p>
     <w:p>
@@ -910,21 +970,21 @@
           <w:sz w:val="20"/>
           <w:szCs w:val="20"/>
         </w:rPr>
-        <w:t xml:space="preserve">AI-assisted Codebase Analysis &amp; Dokumentation</w:t>
-      </w:r>
-    </w:p>
-    <w:p>
-      <w:pPr>
-        <w:spacing w:after="90"/>
-      </w:pPr>
-      <w:r>
-        <w:rPr>
-          <w:b w:val="false"/>
-          <w:bCs w:val="false"/>
-          <w:sz w:val="20"/>
-          <w:szCs w:val="20"/>
-        </w:rPr>
-        <w:t xml:space="preserve">KI-gestützte Analyse neuer und bestehender Projekte, API-Analyse, Refactoring-Vorbereitung, Parser- und Skriptunterstützung, README-Erstellung, Projektgraphen und Testvorbereitung.</w:t>
+        <w:t xml:space="preserve">KI-gestützte Codebase-Analyse &amp; Dokumentation</w:t>
+      </w:r>
+    </w:p>
+    <w:p>
+      <w:pPr>
+        <w:spacing w:after="90"/>
+      </w:pPr>
+      <w:r>
+        <w:rPr>
+          <w:b w:val="false"/>
+          <w:bCs w:val="false"/>
+          <w:sz w:val="20"/>
+          <w:szCs w:val="20"/>
+        </w:rPr>
+        <w:t xml:space="preserve">API-Analyse, Parser, Projektgraphen, README-Erstellung, Testvorbereitung und technische Orientierung in fremden Projekten mit KI-Unterstützung. Ziel: schnelleres Verständnis, bessere Dokumentation und belastbarere technische Entscheidungen.</w:t>
       </w:r>
     </w:p>
     <w:p>
@@ -966,21 +1026,21 @@
           <w:sz w:val="20"/>
           <w:szCs w:val="20"/>
         </w:rPr>
-        <w:t xml:space="preserve">Web/API Testing und technische Dokumentation</w:t>
-      </w:r>
-    </w:p>
-    <w:p>
-      <w:pPr>
-        <w:spacing w:after="90"/>
-      </w:pPr>
-      <w:r>
-        <w:rPr>
-          <w:b w:val="false"/>
-          <w:bCs w:val="false"/>
-          <w:sz w:val="20"/>
-          <w:szCs w:val="20"/>
-        </w:rPr>
-        <w:t xml:space="preserve">Manuelle API-Prüfung mit Postman, Browser DevTools, Website-Tests, technische Dokumentation, Fehlereingrenzung und Vorbereitung nachvollziehbarer Testfälle.</w:t>
+        <w:t xml:space="preserve">Web/API-Tests und technische Dokumentation</w:t>
+      </w:r>
+    </w:p>
+    <w:p>
+      <w:pPr>
+        <w:spacing w:after="90"/>
+      </w:pPr>
+      <w:r>
+        <w:rPr>
+          <w:b w:val="false"/>
+          <w:bCs w:val="false"/>
+          <w:sz w:val="20"/>
+          <w:szCs w:val="20"/>
+        </w:rPr>
+        <w:t xml:space="preserve">Postman, Browser DevTools, manuelle API-Prüfung, Website-Tests, Fehlernachverfolgung und testbare Dokumentation. Fokus: Fehler reproduzierbar machen, Schnittstellen verstehen und Ergebnisse so beschreiben, dass Umsetzung und Abnahme anschließen können.</w:t>
       </w:r>
     </w:p>
     <w:p>
@@ -1003,7 +1063,21 @@
           <w:sz w:val="20"/>
           <w:szCs w:val="20"/>
         </w:rPr>
-        <w:t xml:space="preserve">Praktische Werkstatterfahrung in Diagnose und Reparatur elektronischer Baugruppen mit Fokus auf Computertechnik, Mainboards, Monitore, Smartphones, Tablets, Netzteile, Grafikkarten, Router und TV-Boxes.</w:t>
+        <w:t xml:space="preserve">Langjährige praktische Werkstatt- und Diagnoseerfahrung mit elektronischen Baugruppen und IT-naher Gerätetechnik.</w:t>
+      </w:r>
+    </w:p>
+    <w:p>
+      <w:pPr>
+        <w:spacing w:after="90"/>
+      </w:pPr>
+      <w:r>
+        <w:rPr>
+          <w:b w:val="false"/>
+          <w:bCs w:val="false"/>
+          <w:sz w:val="20"/>
+          <w:szCs w:val="20"/>
+        </w:rPr>
+        <w:t xml:space="preserve">Geräte: Notebooks · Mainboards · Monitore · Smartphones · Tablets · Netzteile · Grafikkarten · Router · TV-Boxes · Peripherie</w:t>
       </w:r>
     </w:p>
     <w:p>
@@ -1037,7 +1111,7 @@
           <w:sz w:val="20"/>
           <w:szCs w:val="20"/>
         </w:rPr>
-        <w:t xml:space="preserve">Diagnose von Stromversorgung, Kurzschlüssen, Start- und Firmwareproblemen</w:t>
+        <w:t xml:space="preserve">Stromversorgungsdiagnose, Kurzschlussanalyse und Eingrenzung von Start-/Boot-/Firmwareproblemen</w:t>
       </w:r>
     </w:p>
     <w:p>
@@ -1088,7 +1162,7 @@
           <w:sz w:val="20"/>
           <w:szCs w:val="20"/>
         </w:rPr>
-        <w:t xml:space="preserve">Firmware-/BIOS-/EEPROM-Flashing, Funktionsprüfung und technische Befundung</w:t>
+        <w:t xml:space="preserve">Firmware-/BIOS-/EEPROM-Flashing, Funktionsprüfung, Befundung und nachvollziehbare Reparaturdokumentation</w:t>
       </w:r>
     </w:p>
     <w:p>

</xml_diff>